<commit_message>
Add live BTP URL and GitHub link to README, WPA-Readme.md and .docx
</commit_message>
<xml_diff>
--- a/WPA-Readme.docx
+++ b/WPA-Readme.docx
@@ -10808,6 +10808,52 @@
       </w:r>
     </w:p>
     <w:p/>
+    <w:p>
+      <w:pPr>
+        <w:pStyle w:val="Heading2"/>
+      </w:pPr>
+      <w:r>
+        <w:t>Live Demo</w:t>
+      </w:r>
+    </w:p>
+    <w:p>
+      <w:r>
+        <w:rPr>
+          <w:rFonts w:ascii="Calibri" w:hAnsi="Calibri"/>
+          <w:b/>
+          <w:color w:val="1D2D3E"/>
+          <w:sz w:val="20"/>
+        </w:rPr>
+        <w:t xml:space="preserve">Live URL: </w:t>
+      </w:r>
+      <w:r>
+        <w:rPr>
+          <w:rFonts w:ascii="Calibri" w:hAnsi="Calibri"/>
+          <w:color w:val="0A6ED1"/>
+          <w:sz w:val="20"/>
+        </w:rPr>
+        <w:t>https://workforce-planning-agent.cfapps.us10-001.hana.ondemand.com/</w:t>
+      </w:r>
+    </w:p>
+    <w:p>
+      <w:r>
+        <w:rPr>
+          <w:rFonts w:ascii="Calibri" w:hAnsi="Calibri"/>
+          <w:b/>
+          <w:color w:val="1D2D3E"/>
+          <w:sz w:val="20"/>
+        </w:rPr>
+        <w:t xml:space="preserve">GitHub: </w:t>
+      </w:r>
+      <w:r>
+        <w:rPr>
+          <w:rFonts w:ascii="Calibri" w:hAnsi="Calibri"/>
+          <w:color w:val="0A6ED1"/>
+          <w:sz w:val="20"/>
+        </w:rPr>
+        <w:t>https://github.com/veerannas/workforce-planning-agent</w:t>
+      </w:r>
+    </w:p>
     <w:sectPr>
       <w:pgSz w:w="12240" w:h="15840"/>
       <w:pgMar w:top="1020" w:right="1134" w:bottom="1020" w:left="1134" w:header="720" w:footer="720" w:gutter="0"/>

</xml_diff>

<commit_message>
Update WPA-Readme.docx with Live Demo section (BTP URL + GitHub link)
</commit_message>
<xml_diff>
--- a/WPA-Readme.docx
+++ b/WPA-Readme.docx
@@ -6229,9 +6229,9 @@
       </w:tblPr>
       <w:tblGrid>
         <w:gridCol w:w="1393"/>
-        <w:gridCol w:w="1665"/>
-        <w:gridCol w:w="1940"/>
-        <w:gridCol w:w="4362"/>
+        <w:gridCol w:w="1666"/>
+        <w:gridCol w:w="1932"/>
+        <w:gridCol w:w="4369"/>
       </w:tblGrid>
       <w:tr>
         <w:tc>
@@ -6280,7 +6280,7 @@
                 <w:color w:val="FFFFFF"/>
                 <w:sz w:val="18"/>
               </w:rPr>
-              <w:t>Employee ID</w:t>
+              <w:t>Username</w:t>
             </w:r>
           </w:p>
         </w:tc>
@@ -6305,7 +6305,7 @@
                 <w:color w:val="FFFFFF"/>
                 <w:sz w:val="18"/>
               </w:rPr>
-              <w:t>Department</w:t>
+              <w:t>Password</w:t>
             </w:r>
           </w:p>
         </w:tc>
@@ -6378,7 +6378,13 @@
               <w:rPr>
                 <w:sz w:val="18"/>
               </w:rPr>
-              <w:t>EMP01025</w:t>
+              <w:t>e</w:t>
+            </w:r>
+            <w:r>
+              <w:rPr>
+                <w:sz w:val="18"/>
+              </w:rPr>
+              <w:t>mployee</w:t>
             </w:r>
           </w:p>
         </w:tc>
@@ -6401,7 +6407,7 @@
               <w:rPr>
                 <w:sz w:val="18"/>
               </w:rPr>
-              <w:t>Finance</w:t>
+              <w:t>emp123</w:t>
             </w:r>
           </w:p>
         </w:tc>
@@ -6472,7 +6478,13 @@
               <w:rPr>
                 <w:sz w:val="18"/>
               </w:rPr>
-              <w:t>EMP01050</w:t>
+              <w:t>m</w:t>
+            </w:r>
+            <w:r>
+              <w:rPr>
+                <w:sz w:val="18"/>
+              </w:rPr>
+              <w:t>anager</w:t>
             </w:r>
           </w:p>
         </w:tc>
@@ -6492,10 +6504,7 @@
               <w:spacing w:before="40" w:after="40"/>
             </w:pPr>
             <w:r>
-              <w:rPr>
-                <w:sz w:val="18"/>
-              </w:rPr>
-              <w:t>Technology</w:t>
+              <w:t>man123</w:t>
             </w:r>
           </w:p>
         </w:tc>
@@ -6566,7 +6575,13 @@
               <w:rPr>
                 <w:sz w:val="18"/>
               </w:rPr>
-              <w:t>EMP01130</w:t>
+              <w:t>e</w:t>
+            </w:r>
+            <w:r>
+              <w:rPr>
+                <w:sz w:val="18"/>
+              </w:rPr>
+              <w:t>xecutive</w:t>
             </w:r>
           </w:p>
         </w:tc>
@@ -6589,7 +6604,7 @@
               <w:rPr>
                 <w:sz w:val="18"/>
               </w:rPr>
-              <w:t>Operations</w:t>
+              <w:t>exe123</w:t>
             </w:r>
           </w:p>
         </w:tc>
@@ -10819,18 +10834,13 @@
     <w:p>
       <w:r>
         <w:rPr>
-          <w:rFonts w:ascii="Calibri" w:hAnsi="Calibri"/>
           <w:b/>
-          <w:color w:val="1D2D3E"/>
-          <w:sz w:val="20"/>
         </w:rPr>
         <w:t xml:space="preserve">Live URL: </w:t>
       </w:r>
       <w:r>
         <w:rPr>
-          <w:rFonts w:ascii="Calibri" w:hAnsi="Calibri"/>
           <w:color w:val="0A6ED1"/>
-          <w:sz w:val="20"/>
         </w:rPr>
         <w:t>https://workforce-planning-agent.cfapps.us10-001.hana.ondemand.com/</w:t>
       </w:r>
@@ -10838,18 +10848,13 @@
     <w:p>
       <w:r>
         <w:rPr>
-          <w:rFonts w:ascii="Calibri" w:hAnsi="Calibri"/>
           <w:b/>
-          <w:color w:val="1D2D3E"/>
-          <w:sz w:val="20"/>
         </w:rPr>
         <w:t xml:space="preserve">GitHub: </w:t>
       </w:r>
       <w:r>
         <w:rPr>
-          <w:rFonts w:ascii="Calibri" w:hAnsi="Calibri"/>
           <w:color w:val="0A6ED1"/>
-          <w:sz w:val="20"/>
         </w:rPr>
         <w:t>https://github.com/veerannas/workforce-planning-agent</w:t>
       </w:r>

</xml_diff>

<commit_message>
rename actions: BUILD→UPSKILL, BUY→HIRE, REDEPLOY→RESKILL across backend, frontend, docs and diagrams
</commit_message>
<xml_diff>
--- a/WPA-Readme.docx
+++ b/WPA-Readme.docx
@@ -142,7 +142,7 @@
         <w:rPr>
           <w:color w:val="1A1A1A"/>
         </w:rPr>
-        <w:t>This agent solves one focused problem: given a natural-language strategic scenario (e.g., 'Double AI/ML capacity while reducing back-office operations by 20% over 3 years'), it returns a prioritized workforce action plan using the Build, Buy, Redeploy, Automate (BBRA) framework — an industry-standard decision model validated by KPMG, McKinsey, and INOP (2025–26).</w:t>
+        <w:t>This agent solves one focused problem: given a natural-language strategic scenario (e.g., 'Double AI/ML capacity while reducing back-office operations by 20% over 3 years'), it returns a prioritized workforce action plan using the UpSkill, Hire, ReSkill, Automate (BBRA) framework — an industry-standard decision model validated by KPMG, McKinsey, and INOP (2025–26).</w:t>
       </w:r>
     </w:p>
     <w:p>
@@ -292,7 +292,7 @@
               <w:rPr>
                 <w:sz w:val="18"/>
               </w:rPr>
-              <w:t>Build (Reskill)</w:t>
+              <w:t>UpSkill (ReSkill)</w:t>
             </w:r>
           </w:p>
         </w:tc>
@@ -386,7 +386,7 @@
               <w:rPr>
                 <w:sz w:val="18"/>
               </w:rPr>
-              <w:t>Buy (Hire)</w:t>
+              <w:t>Hire (Hire)</w:t>
             </w:r>
           </w:p>
         </w:tc>
@@ -480,7 +480,7 @@
               <w:rPr>
                 <w:sz w:val="18"/>
               </w:rPr>
-              <w:t>Redeploy (Move)</w:t>
+              <w:t>ReSkill (Move)</w:t>
             </w:r>
           </w:p>
         </w:tc>
@@ -823,7 +823,6 @@
               <w:rPr>
                 <w:sz w:val="18"/>
               </w:rPr>
-              <w:lastRenderedPageBreak/>
               <w:t>PHASE 1</w:t>
             </w:r>
           </w:p>
@@ -1159,7 +1158,7 @@
               <w:rPr>
                 <w:sz w:val="18"/>
               </w:rPr>
-              <w:t>OUT: Per-employee scores (reskill fit, redeploy fit, retention risk) + HR Review Queue</w:t>
+              <w:t>OUT: Per-employee scores (reskill fit, reskill fit, retention risk) + HR Review Queue</w:t>
             </w:r>
           </w:p>
         </w:tc>
@@ -1682,7 +1681,7 @@
               <w:rPr>
                 <w:sz w:val="18"/>
               </w:rPr>
-              <w:t>Assess each employee's reskilling and redeployment potential from profile signals</w:t>
+              <w:t>Assess each employee's reskilling and reskillment potential from profile signals</w:t>
             </w:r>
           </w:p>
         </w:tc>
@@ -2258,7 +2257,7 @@
               <w:rPr>
                 <w:sz w:val="18"/>
               </w:rPr>
-              <w:t>Headcount math assertion: future = current + hired − separated ± redeployed</w:t>
+              <w:t>Headcount math assertion: future = current + hired − separated ± reskilled</w:t>
             </w:r>
           </w:p>
         </w:tc>
@@ -2375,7 +2374,6 @@
         <w:rPr>
           <w:color w:val="1A376C"/>
         </w:rPr>
-        <w:lastRenderedPageBreak/>
         <w:t>4.  Handling Uncertainty — The Uncertainty Engine</w:t>
       </w:r>
     </w:p>
@@ -3163,7 +3161,7 @@
               <w:rPr>
                 <w:sz w:val="18"/>
               </w:rPr>
-              <w:t>Assert: future = current + hired − separated ± redeployed per dept</w:t>
+              <w:t>Assert: future = current + hired − separated ± reskilled per dept</w:t>
             </w:r>
           </w:p>
         </w:tc>
@@ -3743,7 +3741,6 @@
         <w:rPr>
           <w:color w:val="1A376C"/>
         </w:rPr>
-        <w:lastRenderedPageBreak/>
         <w:t>7.  Key Tradeoffs</w:t>
       </w:r>
     </w:p>
@@ -4758,7 +4755,7 @@
               <w:rPr>
                 <w:sz w:val="18"/>
               </w:rPr>
-              <w:t>Build Quickly</w:t>
+              <w:t>UpSkill Quickly</w:t>
             </w:r>
           </w:p>
         </w:tc>
@@ -4816,16 +4813,13 @@
       </w:pPr>
     </w:p>
     <w:p>
-      <w:r>
-        <w:br w:type="page"/>
-      </w:r>
+      <w:r/>
     </w:p>
     <w:p>
       <w:pPr>
         <w:pStyle w:val="Heading1"/>
       </w:pPr>
       <w:r>
-        <w:lastRenderedPageBreak/>
         <w:t>9.  Feature Comparison by Role</w:t>
       </w:r>
     </w:p>
@@ -5380,7 +5374,7 @@
               <w:rPr>
                 <w:sz w:val="18"/>
               </w:rPr>
-              <w:t>Reskilling Center</w:t>
+              <w:t>ReSkilling Center</w:t>
             </w:r>
           </w:p>
         </w:tc>
@@ -5474,7 +5468,7 @@
               <w:rPr>
                 <w:sz w:val="18"/>
               </w:rPr>
-              <w:t>Redeployment Hub</w:t>
+              <w:t>ReSkillment Hub</w:t>
             </w:r>
           </w:p>
         </w:tc>
@@ -6634,16 +6628,13 @@
       </w:tr>
     </w:tbl>
     <w:p>
-      <w:r>
-        <w:br w:type="page"/>
-      </w:r>
+      <w:r/>
     </w:p>
     <w:p>
       <w:pPr>
         <w:pStyle w:val="Heading1"/>
       </w:pPr>
       <w:r>
-        <w:lastRenderedPageBreak/>
         <w:t>10.  Platform Architecture</w:t>
       </w:r>
     </w:p>
@@ -6669,41 +6660,6 @@
         <w:rPr>
           <w:noProof/>
         </w:rPr>
-        <w:drawing>
-          <wp:inline distT="0" distB="0" distL="0" distR="0" wp14:anchorId="3AF0C6BF" wp14:editId="77A133C3">
-            <wp:extent cx="6604782" cy="4678387"/>
-            <wp:effectExtent l="0" t="0" r="0" b="0"/>
-            <wp:docPr id="1" name="Picture 1"/>
-            <wp:cNvGraphicFramePr>
-              <a:graphicFrameLocks xmlns:a="http://schemas.openxmlformats.org/drawingml/2006/main" noChangeAspect="1"/>
-            </wp:cNvGraphicFramePr>
-            <a:graphic xmlns:a="http://schemas.openxmlformats.org/drawingml/2006/main">
-              <a:graphicData uri="http://schemas.openxmlformats.org/drawingml/2006/picture">
-                <pic:pic xmlns:pic="http://schemas.openxmlformats.org/drawingml/2006/picture">
-                  <pic:nvPicPr>
-                    <pic:cNvPr id="0" name="image.png"/>
-                    <pic:cNvPicPr/>
-                  </pic:nvPicPr>
-                  <pic:blipFill>
-                    <a:blip r:embed="rId6"/>
-                    <a:stretch>
-                      <a:fillRect/>
-                    </a:stretch>
-                  </pic:blipFill>
-                  <pic:spPr>
-                    <a:xfrm>
-                      <a:off x="0" y="0"/>
-                      <a:ext cx="6650635" cy="4710866"/>
-                    </a:xfrm>
-                    <a:prstGeom prst="rect">
-                      <a:avLst/>
-                    </a:prstGeom>
-                  </pic:spPr>
-                </pic:pic>
-              </a:graphicData>
-            </a:graphic>
-          </wp:inline>
-        </w:drawing>
       </w:r>
     </w:p>
     <w:p>
@@ -7979,7 +7935,7 @@
               <w:rPr>
                 <w:sz w:val="18"/>
               </w:rPr>
-              <w:t>Build Tool</w:t>
+              <w:t>UpSkill Tool</w:t>
             </w:r>
           </w:p>
         </w:tc>
@@ -8380,7 +8336,7 @@
               <w:rPr>
                 <w:sz w:val="18"/>
               </w:rPr>
-              <w:t>cflinuxfs4 + python_buildpack 1.9.0</w:t>
+              <w:t>cflinuxfs4 + python_upskillpack 1.9.0</w:t>
             </w:r>
           </w:p>
         </w:tc>
@@ -9355,7 +9311,7 @@
               <w:rPr>
                 <w:sz w:val="18"/>
               </w:rPr>
-              <w:t>Long-term capability build</w:t>
+              <w:t>Long-term capability upskill</w:t>
             </w:r>
           </w:p>
         </w:tc>
@@ -9683,7 +9639,6 @@
         <w:spacing w:before="200" w:after="80"/>
       </w:pPr>
       <w:r>
-        <w:lastRenderedPageBreak/>
         <w:t>API Reference</w:t>
       </w:r>
     </w:p>
@@ -10520,7 +10475,7 @@
               <w:rPr>
                 <w:sz w:val="18"/>
               </w:rPr>
-              <w:t>Buildpack</w:t>
+              <w:t>UpSkillpack</w:t>
             </w:r>
           </w:p>
         </w:tc>
@@ -10543,7 +10498,7 @@
               <w:rPr>
                 <w:sz w:val="18"/>
               </w:rPr>
-              <w:t>python_buildpack 1.9.0</w:t>
+              <w:t>python_upskillpack 1.9.0</w:t>
             </w:r>
           </w:p>
         </w:tc>
@@ -10647,7 +10602,7 @@
     </w:tbl>
     <w:p>
       <w:r>
-        <w:t>Frontend built via npm run build → copied to backend/static/. Single CF app serves both API and SPA.</w:t>
+        <w:t>Frontend built via npm run upskill → copied to backend/static/. Single CF app serves both API and SPA.</w:t>
       </w:r>
     </w:p>
     <w:p/>
@@ -10676,41 +10631,6 @@
         <w:rPr>
           <w:noProof/>
         </w:rPr>
-        <w:drawing>
-          <wp:inline distT="0" distB="0" distL="0" distR="0" wp14:anchorId="64336F4B" wp14:editId="244174BA">
-            <wp:extent cx="5486400" cy="3429000"/>
-            <wp:effectExtent l="0" t="0" r="0" b="0"/>
-            <wp:docPr id="2" name="Picture 2"/>
-            <wp:cNvGraphicFramePr>
-              <a:graphicFrameLocks xmlns:a="http://schemas.openxmlformats.org/drawingml/2006/main" noChangeAspect="1"/>
-            </wp:cNvGraphicFramePr>
-            <a:graphic xmlns:a="http://schemas.openxmlformats.org/drawingml/2006/main">
-              <a:graphicData uri="http://schemas.openxmlformats.org/drawingml/2006/picture">
-                <pic:pic xmlns:pic="http://schemas.openxmlformats.org/drawingml/2006/picture">
-                  <pic:nvPicPr>
-                    <pic:cNvPr id="0" name="image.png"/>
-                    <pic:cNvPicPr/>
-                  </pic:nvPicPr>
-                  <pic:blipFill>
-                    <a:blip r:embed="rId7"/>
-                    <a:stretch>
-                      <a:fillRect/>
-                    </a:stretch>
-                  </pic:blipFill>
-                  <pic:spPr>
-                    <a:xfrm>
-                      <a:off x="0" y="0"/>
-                      <a:ext cx="5486400" cy="3429000"/>
-                    </a:xfrm>
-                    <a:prstGeom prst="rect">
-                      <a:avLst/>
-                    </a:prstGeom>
-                  </pic:spPr>
-                </pic:pic>
-              </a:graphicData>
-            </a:graphic>
-          </wp:inline>
-        </w:drawing>
       </w:r>
     </w:p>
     <w:p/>
@@ -10730,42 +10650,6 @@
         <w:rPr>
           <w:noProof/>
         </w:rPr>
-        <w:lastRenderedPageBreak/>
-        <w:drawing>
-          <wp:inline distT="0" distB="0" distL="0" distR="0" wp14:anchorId="7E27CD4C" wp14:editId="57FBD29F">
-            <wp:extent cx="5486400" cy="3429000"/>
-            <wp:effectExtent l="0" t="0" r="0" b="0"/>
-            <wp:docPr id="3" name="Picture 3"/>
-            <wp:cNvGraphicFramePr>
-              <a:graphicFrameLocks xmlns:a="http://schemas.openxmlformats.org/drawingml/2006/main" noChangeAspect="1"/>
-            </wp:cNvGraphicFramePr>
-            <a:graphic xmlns:a="http://schemas.openxmlformats.org/drawingml/2006/main">
-              <a:graphicData uri="http://schemas.openxmlformats.org/drawingml/2006/picture">
-                <pic:pic xmlns:pic="http://schemas.openxmlformats.org/drawingml/2006/picture">
-                  <pic:nvPicPr>
-                    <pic:cNvPr id="0" name="image.png"/>
-                    <pic:cNvPicPr/>
-                  </pic:nvPicPr>
-                  <pic:blipFill>
-                    <a:blip r:embed="rId8"/>
-                    <a:stretch>
-                      <a:fillRect/>
-                    </a:stretch>
-                  </pic:blipFill>
-                  <pic:spPr>
-                    <a:xfrm>
-                      <a:off x="0" y="0"/>
-                      <a:ext cx="5486400" cy="3429000"/>
-                    </a:xfrm>
-                    <a:prstGeom prst="rect">
-                      <a:avLst/>
-                    </a:prstGeom>
-                  </pic:spPr>
-                </pic:pic>
-              </a:graphicData>
-            </a:graphic>
-          </wp:inline>
-        </w:drawing>
       </w:r>
     </w:p>
     <w:p/>
@@ -10785,41 +10669,6 @@
         <w:rPr>
           <w:noProof/>
         </w:rPr>
-        <w:drawing>
-          <wp:inline distT="0" distB="0" distL="0" distR="0" wp14:anchorId="72CBFAE5" wp14:editId="16651AEE">
-            <wp:extent cx="5486400" cy="3429000"/>
-            <wp:effectExtent l="0" t="0" r="0" b="0"/>
-            <wp:docPr id="4" name="Picture 4"/>
-            <wp:cNvGraphicFramePr>
-              <a:graphicFrameLocks xmlns:a="http://schemas.openxmlformats.org/drawingml/2006/main" noChangeAspect="1"/>
-            </wp:cNvGraphicFramePr>
-            <a:graphic xmlns:a="http://schemas.openxmlformats.org/drawingml/2006/main">
-              <a:graphicData uri="http://schemas.openxmlformats.org/drawingml/2006/picture">
-                <pic:pic xmlns:pic="http://schemas.openxmlformats.org/drawingml/2006/picture">
-                  <pic:nvPicPr>
-                    <pic:cNvPr id="0" name="image.png"/>
-                    <pic:cNvPicPr/>
-                  </pic:nvPicPr>
-                  <pic:blipFill>
-                    <a:blip r:embed="rId9"/>
-                    <a:stretch>
-                      <a:fillRect/>
-                    </a:stretch>
-                  </pic:blipFill>
-                  <pic:spPr>
-                    <a:xfrm>
-                      <a:off x="0" y="0"/>
-                      <a:ext cx="5486400" cy="3429000"/>
-                    </a:xfrm>
-                    <a:prstGeom prst="rect">
-                      <a:avLst/>
-                    </a:prstGeom>
-                  </pic:spPr>
-                </pic:pic>
-              </a:graphicData>
-            </a:graphic>
-          </wp:inline>
-        </w:drawing>
       </w:r>
     </w:p>
     <w:p/>

</xml_diff>